<commit_message>
Contrato por empresa (raiz de CNPJ) com Anexo 1, substituicao por contrato novo e servicos marcaveis (migration 039)
</commit_message>
<xml_diff>
--- a/api/templates/contrato_modelo.docx
+++ b/api/templates/contrato_modelo.docx
@@ -36,6 +36,9 @@
         <w:t>{{CONTRATANTE_CNPJ}}</w:t>
       </w:r>
       <w:r>
+        <w:t>{{CONTRATANTE_DEMAIS}}</w:t>
+      </w:r>
+      <w:r>
         <w:t xml:space="preserve">, daqui por diante denominada apenas </w:t>
       </w:r>
       <w:r>
@@ -57,15 +60,6 @@
       </w:r>
       <w:r>
         <w:t>, têm firmado o presente acordo de atendimento mediante cláusulas abaixo:</w:t>
-      </w:r>
-    </w:p>
-    <w:p>
-      <w:pPr>
-        <w:spacing w:after="120" w:before="0"/>
-        <w:jc w:val="both"/>
-      </w:pPr>
-      <w:r>
-        <w:t>{{CNPJ_ADICIONAL}}</w:t>
       </w:r>
     </w:p>
     <w:p>
@@ -329,6 +323,16 @@
       </w:pPr>
       <w:r>
         <w:t>2.6) Implantação de Fatores de Riscos Psicossociais (NR-01);</w:t>
+      </w:r>
+    </w:p>
+    <w:p>
+      <w:pPr>
+        <w:spacing w:after="120" w:before="0"/>
+        <w:ind w:left="340"/>
+        <w:jc w:val="both"/>
+      </w:pPr>
+      <w:r>
+        <w:t>{{SERVICO_EXTRA}}</w:t>
       </w:r>
     </w:p>
     <w:p>
@@ -867,6 +871,15 @@
         <w:jc w:val="both"/>
       </w:pPr>
       <w:r>
+        <w:t>{{SUBSTITUICAO}}</w:t>
+      </w:r>
+    </w:p>
+    <w:p>
+      <w:pPr>
+        <w:spacing w:after="120" w:before="160"/>
+        <w:jc w:val="both"/>
+      </w:pPr>
+      <w:r>
         <w:t>As partes elegem o FORO DA COMARCA DE GUARULHOS para dirimir quaisquer dúvidas oriundas deste Contrato.</w:t>
       </w:r>
     </w:p>
@@ -1063,6 +1076,30 @@
       </w:pPr>
       <w:r>
         <w:t>Controller Medicina e Segurança do Trabalho Ltda.</w:t>
+      </w:r>
+    </w:p>
+    <w:p>
+      <w:pPr>
+        <w:pageBreakBefore/>
+        <w:spacing w:after="200" w:before="0"/>
+        <w:jc w:val="left"/>
+      </w:pPr>
+      <w:r>
+        <w:rPr>
+          <w:b/>
+          <w:u w:val="none"/>
+        </w:rPr>
+        <w:t>{{ANEXO_TITULO}}</w:t>
+      </w:r>
+    </w:p>
+    <w:p>
+      <w:pPr>
+        <w:spacing w:after="80" w:before="0"/>
+        <w:ind w:left="340"/>
+        <w:jc w:val="left"/>
+      </w:pPr>
+      <w:r>
+        <w:t>{{ANEXO_LINHA}}</w:t>
       </w:r>
     </w:p>
     <w:sectPr>

</xml_diff>

<commit_message>
Contrato: primeiro vencimento 30 dias apos a emissao, depois mensal no mesmo dia (migration 041)
</commit_message>
<xml_diff>
--- a/api/templates/contrato_modelo.docx
+++ b/api/templates/contrato_modelo.docx
@@ -504,13 +504,25 @@
         <w:t>CONTRATADA</w:t>
       </w:r>
       <w:r>
-        <w:t xml:space="preserve">, pelos serviços constantes nas Cláusulas 1, 2 e 3, o valor correspondente conforme segue, com vencimento todo dia </w:t>
+        <w:t xml:space="preserve">, pelos serviços constantes nas Cláusulas 1, 2 e 3, o valor correspondente conforme segue, com o primeiro vencimento em </w:t>
+      </w:r>
+      <w:r>
+        <w:t>{{PRIMEIRO_VENCIMENTO}}</w:t>
+      </w:r>
+      <w:r>
+        <w:t xml:space="preserve"> e os demais todo dia </w:t>
       </w:r>
       <w:r>
         <w:t>{{DIA_VENCIMENTO}}</w:t>
       </w:r>
       <w:r>
-        <w:t xml:space="preserve"> de cada mês:</w:t>
+        <w:t xml:space="preserve"> de cada mês</w:t>
+      </w:r>
+      <w:r>
+        <w:t>{{VENCIMENTO_AJUSTE}}</w:t>
+      </w:r>
+      <w:r>
+        <w:t>:</w:t>
       </w:r>
     </w:p>
     <w:p>

</xml_diff>